<commit_message>
Integrated Universal SmartArt Compiler Engine (MarkSmith v2) and Repaired CLI
</commit_message>
<xml_diff>
--- a/marksmith-v2/rt_mermaid.docx
+++ b/marksmith-v2/rt_mermaid.docx
@@ -83,8 +83,8 @@
       </w:r>
     </w:p>
     <w:sectPr>
-      <w:headerReference xmlns:r="http://schemas.openxmlformats.org/officeDocument/2006/relationships" w:type="default" r:id="Rd69a1e85265c4fc2"/>
-      <w:footerReference xmlns:r="http://schemas.openxmlformats.org/officeDocument/2006/relationships" w:type="default" r:id="R61ff7745ece14567"/>
+      <w:headerReference xmlns:r="http://schemas.openxmlformats.org/officeDocument/2006/relationships" w:type="default" r:id="R99df497425ef46fe"/>
+      <w:footerReference xmlns:r="http://schemas.openxmlformats.org/officeDocument/2006/relationships" w:type="default" r:id="R79f24e7d8a714995"/>
       <w:pgSz w:w="11906" w:h="16838"/>
       <w:pgMar w:top="1440" w:right="1440" w:bottom="1440" w:left="1440" w:header="576" w:footer="576" w:gutter="0"/>
     </w:sectPr>
@@ -504,7 +504,7 @@
 </file>
 
 <file path=customXml/item.xml><?xml version="1.0" encoding="utf-8"?>
-<marksmithSource schema="marksmith-source-v1" version="2.0.0.0" exportedUtc="2026-07-31T16:52:30.5946840Z" theme="GitHub Light" mermaidMode="1">
+<marksmithSource schema="marksmith-source-v1" version="2.0.0.0" exportedUtc="2026-08-01T10:53:23.1481381Z" theme="GitHub Light" mermaidMode="1">
   <markdown><![CDATA[# Diagram Round Trip
 ```mermaid
 flowchart TD

</xml_diff>